<commit_message>
Added in frontend capability with streamlit so that user can drop in job description and get tailored resume and cover letter in a simple interface
</commit_message>
<xml_diff>
--- a/output/tailored_cover_letter.docx
+++ b/output/tailored_cover_letter.docx
@@ -232,43 +232,43 @@
         </w:rPr>
       </w:pPr>
       <w:r>
-        <w:t>I am writing to express my strong interest in the Associate - Baseball Research and Development position with the Milwaukee Brewers. With a proven track record of developing automated reporting tools, building predictive forecasting models, and implementing emerging technologies across organizations such as J.D. Irving, IMP Aerospace, and Irving Shipbuilding, I am eager to apply my analytical experience to deliver actionable insights and decision-making tools for Baseball Operations.</w:t>
-      </w:r>
-    </w:p>
-    <w:p>
-      <w:pPr>
-        <w:rPr>
-          <w:rFonts w:ascii="Times New Roman" w:hAnsi="Times New Roman" w:cs="Times New Roman"/>
-          <w:sz w:val="24"/>
-          <w:szCs w:val="24"/>
-        </w:rPr>
-      </w:pPr>
-      <w:r>
-        <w:t>Throughout my experience, I have focused on translating complex data into accessible, high-impact solutions for diverse stakeholders. At IMP Aerospace, I replaced manual Excel calculations by developing automated Power BI and SQL dashboards and created recovery forecasting measures utilizing DAX to project schedules and handover dates. Similarly, at J.D. Irving, I designed an executive Learning &amp; Development Dashboard that established a single source of truth and saved 40–60 hours annually. Beyond traditional business intelligence, I have evaluated and implemented emerging data and AI solutions; I engineered 'HR Pathfinder,' a RAG-based AI assistant with rigorous testing guardrails that maintained a 0% failure rate across 123 potential users, and built 'Interview HQ,' a Power Apps platform that leveraged AI agents and prompt engineering for candidate scoring and workflow automation. Combined with my background in SQL data analysis and inventory analytics at Irving Shipbuilding, these experiences have equipped me to investigate data sources, build robust models, and develop intuitive visualizations for both technical and non-technical personnel.</w:t>
-      </w:r>
-    </w:p>
-    <w:p>
-      <w:pPr>
-        <w:rPr>
-          <w:rFonts w:ascii="Times New Roman" w:hAnsi="Times New Roman" w:cs="Times New Roman"/>
-          <w:sz w:val="24"/>
-          <w:szCs w:val="24"/>
-        </w:rPr>
-      </w:pPr>
-      <w:r>
-        <w:t>I am drawn to the Milwaukee Brewers because of the Research and Development Department's commitment to innovation, collaboration, and high-standard decision-making in pursuit of a World Series championship. I admire the club's emphasis on empowering teams through diverse perspectives and would welcome the opportunity to contribute to a purpose-led front office where analytical research directly impacts organizational strategy.</w:t>
-      </w:r>
-    </w:p>
-    <w:p>
-      <w:pPr>
-        <w:rPr>
-          <w:rFonts w:ascii="Times New Roman" w:hAnsi="Times New Roman" w:cs="Times New Roman"/>
-          <w:sz w:val="24"/>
-          <w:szCs w:val="24"/>
-        </w:rPr>
-      </w:pPr>
-      <w:r>
-        <w:t>Thank you for your time and consideration. I welcome the opportunity to discuss how my background in data modeling, analytics, and tool development can support the research and operational goals of the Milwaukee Brewers Baseball R&amp;D team.</w:t>
+        <w:t>I am writing to express my strong interest in the Junior Analyst, Player Projections position with the Washington Nationals. With a background spanning predictive forecasting, AI agent integration, data modeling, and SQL-driven analytics across complex environments, I am eager to apply my technical skill set to the Baseball R&amp;D department to support player evaluation and high-stakes decision-making.</w:t>
+      </w:r>
+    </w:p>
+    <w:p>
+      <w:pPr>
+        <w:rPr>
+          <w:rFonts w:ascii="Times New Roman" w:hAnsi="Times New Roman" w:cs="Times New Roman"/>
+          <w:sz w:val="24"/>
+          <w:szCs w:val="24"/>
+        </w:rPr>
+      </w:pPr>
+      <w:r>
+        <w:t>Throughout my experience, I have developed analytical tools, forecasting systems, and AI-driven workflows that directly align with the responsibilities of this role. At IMP Aerospace, I developed forecasting measures for recovery schedules, projected dates, and project handovers utilizing earned value management and operational analytics. My technical foundation includes querying and analyzing data with SQL at Irving Shipbuilding to evaluate utilization, as well as data modeling and executive reporting at J.D. Irving to establish single sources of truth. Furthermore, I bring practical experience in AI agent integration and model governance: at J.D. Irving, I built an automated agent platform for candidate scoring and guide generation, and deployed a RAG-based generative AI system with strict testing methodologies and guardrails that achieved a 0% failure rate. Across projects ranging from healthcare resource optimization at Nova Scotia Health to capital financial modeling at Irving Tissue, I have consistently translated complex quantitative insights into actionable solutions for cross-functional stakeholders.</w:t>
+      </w:r>
+    </w:p>
+    <w:p>
+      <w:pPr>
+        <w:rPr>
+          <w:rFonts w:ascii="Times New Roman" w:hAnsi="Times New Roman" w:cs="Times New Roman"/>
+          <w:sz w:val="24"/>
+          <w:szCs w:val="24"/>
+        </w:rPr>
+      </w:pPr>
+      <w:r>
+        <w:t>I am deeply drawn to the Washington Nationals' vision of becoming baseball's highest-performing organization through a relentless pursuit of excellence. The organization's core values—competitiveness, integrity, humility, and joy—resonate strongly with my approach to analytics. I embrace rigorous, high-stakes problem-solving, value continuous learning and curiosity when evaluating data under uncertainty, and am energized by the opportunity to collaborate with the Player Projections team to drive competitive advantages on the field.</w:t>
+      </w:r>
+    </w:p>
+    <w:p>
+      <w:pPr>
+        <w:rPr>
+          <w:rFonts w:ascii="Times New Roman" w:hAnsi="Times New Roman" w:cs="Times New Roman"/>
+          <w:sz w:val="24"/>
+          <w:szCs w:val="24"/>
+        </w:rPr>
+      </w:pPr>
+      <w:r>
+        <w:t>Thank you for your time and consideration. I welcome the opportunity to discuss how my background in forecasting, data engineering, and AI systems can contribute to the Washington Nationals' Baseball R&amp;D objectives.</w:t>
       </w:r>
     </w:p>
     <w:p>

</xml_diff>